<commit_message>
Add Proposal Generator (Phase 2)
</commit_message>
<xml_diff>
--- a/Sample Proposal.docx
+++ b/Sample Proposal.docx
@@ -1,6 +1,6 @@
 
 <file path=word/document.xml><?xml version="1.0" encoding="utf-8"?>
-<w:document xmlns:wpc="http://schemas.microsoft.com/office/word/2010/wordprocessingCanvas" xmlns:cx="http://schemas.microsoft.com/office/drawing/2014/chartex" xmlns:cx1="http://schemas.microsoft.com/office/drawing/2015/9/8/chartex" xmlns:cx2="http://schemas.microsoft.com/office/drawing/2015/10/21/chartex" xmlns:cx3="http://schemas.microsoft.com/office/drawing/2016/5/9/chartex" xmlns:cx4="http://schemas.microsoft.com/office/drawing/2016/5/10/chartex" xmlns:cx5="http://schemas.microsoft.com/office/drawing/2016/5/11/chartex" xmlns:cx6="http://schemas.microsoft.com/office/drawing/2016/5/12/chartex" xmlns:cx7="http://schemas.microsoft.com/office/drawing/2016/5/13/chartex" xmlns:cx8="http://schemas.microsoft.com/office/drawing/2016/5/14/chartex" xmlns:mc="http://schemas.openxmlformats.org/markup-compatibility/2006" xmlns:aink="http://schemas.microsoft.com/office/drawing/2016/ink" xmlns:am3d="http://schemas.microsoft.com/office/drawing/2017/model3d" xmlns:o="urn:schemas-microsoft-com:office:office" xmlns:oel="http://schemas.microsoft.com/office/2019/extlst" xmlns:r="http://schemas.openxmlformats.org/officeDocument/2006/relationships" xmlns:m="http://schemas.openxmlformats.org/officeDocument/2006/math" xmlns:v="urn:schemas-microsoft-com:vml" xmlns:wp14="http://schemas.microsoft.com/office/word/2010/wordprocessingDrawing" xmlns:wp="http://schemas.openxmlformats.org/drawingml/2006/wordprocessingDrawing" xmlns:w10="urn:schemas-microsoft-com:office:word" xmlns:w="http://schemas.openxmlformats.org/wordprocessingml/2006/main" xmlns:w14="http://schemas.microsoft.com/office/word/2010/wordml" xmlns:w15="http://schemas.microsoft.com/office/word/2012/wordml" xmlns:w16cex="http://schemas.microsoft.com/office/word/2018/wordml/cex" xmlns:w16cid="http://schemas.microsoft.com/office/word/2016/wordml/cid" xmlns:w16="http://schemas.microsoft.com/office/word/2018/wordml" xmlns:w16du="http://schemas.microsoft.com/office/word/2023/wordml/word16du" xmlns:w16sdtdh="http://schemas.microsoft.com/office/word/2020/wordml/sdtdatahash" xmlns:w16sdtfl="http://schemas.microsoft.com/office/word/2024/wordml/sdtformatlock" xmlns:w16se="http://schemas.microsoft.com/office/word/2015/wordml/symex" xmlns:wpg="http://schemas.microsoft.com/office/word/2010/wordprocessingGroup" xmlns:wpi="http://schemas.microsoft.com/office/word/2010/wordprocessingInk" xmlns:wne="http://schemas.microsoft.com/office/word/2006/wordml" xmlns:wps="http://schemas.microsoft.com/office/word/2010/wordprocessingShape" mc:Ignorable="w14 w15 w16se w16cid w16 w16cex w16sdtdh w16sdtfl w16du wp14">
+<w:document xmlns:wpc="http://schemas.microsoft.com/office/word/2010/wordprocessingCanvas" xmlns:cx="http://schemas.microsoft.com/office/drawing/2014/chartex" xmlns:cx1="http://schemas.microsoft.com/office/drawing/2015/9/8/chartex" xmlns:cx2="http://schemas.microsoft.com/office/drawing/2015/10/21/chartex" xmlns:cx3="http://schemas.microsoft.com/office/drawing/2016/5/9/chartex" xmlns:cx4="http://schemas.microsoft.com/office/drawing/2016/5/10/chartex" xmlns:cx5="http://schemas.microsoft.com/office/drawing/2016/5/11/chartex" xmlns:cx6="http://schemas.microsoft.com/office/drawing/2016/5/12/chartex" xmlns:cx7="http://schemas.microsoft.com/office/drawing/2016/5/13/chartex" xmlns:cx8="http://schemas.microsoft.com/office/drawing/2016/5/14/chartex" xmlns:mc="http://schemas.openxmlformats.org/markup-compatibility/2006" xmlns:aink="http://schemas.microsoft.com/office/drawing/2016/ink" xmlns:am3d="http://schemas.microsoft.com/office/drawing/2017/model3d" xmlns:o="urn:schemas-microsoft-com:office:office" xmlns:r="http://schemas.openxmlformats.org/officeDocument/2006/relationships" xmlns:m="http://schemas.openxmlformats.org/officeDocument/2006/math" xmlns:v="urn:schemas-microsoft-com:vml" xmlns:wp14="http://schemas.microsoft.com/office/word/2010/wordprocessingDrawing" xmlns:wp="http://schemas.openxmlformats.org/drawingml/2006/wordprocessingDrawing" xmlns:w10="urn:schemas-microsoft-com:office:word" xmlns:w="http://schemas.openxmlformats.org/wordprocessingml/2006/main" xmlns:w14="http://schemas.microsoft.com/office/word/2010/wordml" xmlns:w15="http://schemas.microsoft.com/office/word/2012/wordml" xmlns:w16cex="http://schemas.microsoft.com/office/word/2018/wordml/cex" xmlns:w16cid="http://schemas.microsoft.com/office/word/2016/wordml/cid" xmlns:w16="http://schemas.microsoft.com/office/word/2018/wordml" xmlns:w16sdtdh="http://schemas.microsoft.com/office/word/2020/wordml/sdtdatahash" xmlns:w16se="http://schemas.microsoft.com/office/word/2015/wordml/symex" xmlns:wpg="http://schemas.microsoft.com/office/word/2010/wordprocessingGroup" xmlns:wpi="http://schemas.microsoft.com/office/word/2010/wordprocessingInk" xmlns:wne="http://schemas.microsoft.com/office/word/2006/wordml" xmlns:wps="http://schemas.microsoft.com/office/word/2010/wordprocessingShape" mc:Ignorable="w14 w15 w16se w16cid w16 w16cex w16sdtdh wp14">
   <w:body>
     <w:p>
       <w:pPr>
@@ -414,7 +414,7 @@
               </wp:anchor>
             </w:drawing>
           </mc:Choice>
-          <mc:Fallback>
+          <mc:Fallback xmlns:w16sdtfl="http://schemas.microsoft.com/office/word/2024/wordml/sdtformatlock" xmlns:w16du="http://schemas.microsoft.com/office/word/2023/wordml/word16du" xmlns:oel="http://schemas.microsoft.com/office/2019/extlst">
             <w:pict>
               <v:shape w14:anchorId="3AD4B987" id="Graphic 9" o:spid="_x0000_s1026" style="position:absolute;margin-left:21.1pt;margin-top:-.2pt;width:1.45pt;height:26.05pt;z-index:251582976;visibility:visible;mso-wrap-style:square;mso-wrap-distance-left:0;mso-wrap-distance-top:0;mso-wrap-distance-right:0;mso-wrap-distance-bottom:0;mso-position-horizontal:absolute;mso-position-horizontal-relative:page;mso-position-vertical:absolute;mso-position-vertical-relative:text;v-text-anchor:top" coordsize="18415,330835" o:gfxdata="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" path="m18288,l,,,330707r18288,l18288,xe" fillcolor="#57b6c0" stroked="f">
                 <v:path arrowok="t"/>
@@ -909,6 +909,7 @@
               </w:rPr>
               <w:t xml:space="preserve"> </w:t>
             </w:r>
+            <w:proofErr w:type="gramStart"/>
             <w:r>
               <w:rPr>
                 <w:spacing w:val="-2"/>
@@ -916,6 +917,7 @@
               </w:rPr>
               <w:t>Investment</w:t>
             </w:r>
+            <w:proofErr w:type="gramEnd"/>
             <w:r>
               <w:tab/>
             </w:r>
@@ -1808,7 +1810,15 @@
         <w:t xml:space="preserve"> </w:t>
       </w:r>
       <w:r>
-        <w:t>every organisation needs</w:t>
+        <w:t xml:space="preserve">every </w:t>
+      </w:r>
+      <w:proofErr w:type="spellStart"/>
+      <w:r>
+        <w:t>organisation</w:t>
+      </w:r>
+      <w:proofErr w:type="spellEnd"/>
+      <w:r>
+        <w:t xml:space="preserve"> needs</w:t>
       </w:r>
       <w:r>
         <w:rPr>
@@ -2128,12 +2138,14 @@
         </w:rPr>
         <w:t xml:space="preserve"> </w:t>
       </w:r>
+      <w:proofErr w:type="spellStart"/>
       <w:r>
         <w:rPr>
           <w:spacing w:val="-2"/>
         </w:rPr>
         <w:t>customisable</w:t>
       </w:r>
+      <w:proofErr w:type="spellEnd"/>
       <w:r>
         <w:rPr>
           <w:spacing w:val="-14"/>
@@ -2868,7 +2880,31 @@
           <w:sz w:val="21"/>
           <w:szCs w:val="22"/>
         </w:rPr>
-        <w:t>Dedicated internet solution is a business internet line (BIL) which offers direct unshared connectivity to internet. While there are many business broadband options available, internets leased lines are still preferred by most of the small &amp; large businesses.</w:t>
+        <w:t xml:space="preserve">Dedicated internet solution is a business internet line (BIL) which offers direct unshared connectivity to internet. While there are many </w:t>
+      </w:r>
+      <w:proofErr w:type="gramStart"/>
+      <w:r>
+        <w:rPr>
+          <w:rFonts w:ascii="Verdana" w:eastAsia="Verdana" w:hAnsi="Verdana" w:cs="Verdana"/>
+          <w:color w:val="EE0000"/>
+          <w:spacing w:val="-2"/>
+          <w:w w:val="120"/>
+          <w:sz w:val="21"/>
+          <w:szCs w:val="22"/>
+        </w:rPr>
+        <w:t>business</w:t>
+      </w:r>
+      <w:proofErr w:type="gramEnd"/>
+      <w:r>
+        <w:rPr>
+          <w:rFonts w:ascii="Verdana" w:eastAsia="Verdana" w:hAnsi="Verdana" w:cs="Verdana"/>
+          <w:color w:val="EE0000"/>
+          <w:spacing w:val="-2"/>
+          <w:w w:val="120"/>
+          <w:sz w:val="21"/>
+          <w:szCs w:val="22"/>
+        </w:rPr>
+        <w:t xml:space="preserve"> broadband options available, internets leased lines are still preferred by most of the small &amp; large businesses.</w:t>
       </w:r>
     </w:p>
     <w:p>
@@ -3075,13 +3111,31 @@
         </w:rPr>
         <w:t xml:space="preserve"> </w:t>
       </w:r>
+      <w:proofErr w:type="spellStart"/>
       <w:r>
         <w:rPr>
           <w:color w:val="FF0000"/>
           <w:spacing w:val="-2"/>
         </w:rPr>
-        <w:t>Samith Senevirathne</w:t>
-      </w:r>
+        <w:t>Samith</w:t>
+      </w:r>
+      <w:proofErr w:type="spellEnd"/>
+      <w:r>
+        <w:rPr>
+          <w:color w:val="FF0000"/>
+          <w:spacing w:val="-2"/>
+        </w:rPr>
+        <w:t xml:space="preserve"> </w:t>
+      </w:r>
+      <w:proofErr w:type="spellStart"/>
+      <w:r>
+        <w:rPr>
+          <w:color w:val="FF0000"/>
+          <w:spacing w:val="-2"/>
+        </w:rPr>
+        <w:t>Senevirathne</w:t>
+      </w:r>
+      <w:proofErr w:type="spellEnd"/>
       <w:r>
         <w:rPr>
           <w:color w:val="FF0000"/>
@@ -3648,7 +3702,7 @@
               </wp:anchor>
             </w:drawing>
           </mc:Choice>
-          <mc:Fallback>
+          <mc:Fallback xmlns:w16sdtfl="http://schemas.microsoft.com/office/word/2024/wordml/sdtformatlock" xmlns:w16du="http://schemas.microsoft.com/office/word/2023/wordml/word16du" xmlns:oel="http://schemas.microsoft.com/office/2019/extlst">
             <w:pict>
               <v:shape w14:anchorId="2D4746DC" id="Graphic 40" o:spid="_x0000_s1026" style="position:absolute;margin-left:21.1pt;margin-top:-.25pt;width:1.45pt;height:22.2pt;z-index:15715328;visibility:visible;mso-wrap-style:square;mso-wrap-distance-left:0;mso-wrap-distance-top:0;mso-wrap-distance-right:0;mso-wrap-distance-bottom:0;mso-position-horizontal:absolute;mso-position-horizontal-relative:page;mso-position-vertical:absolute;mso-position-vertical-relative:text;v-text-anchor:top" coordsize="18415,281940" o:gfxdata="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" path="m18288,l,,,281940r18288,l18288,xe" fillcolor="#57b6c0" stroked="f">
                 <v:path arrowok="t"/>
@@ -4078,7 +4132,7 @@
               </wp:anchor>
             </w:drawing>
           </mc:Choice>
-          <mc:Fallback>
+          <mc:Fallback xmlns:w16sdtfl="http://schemas.microsoft.com/office/word/2024/wordml/sdtformatlock" xmlns:w16du="http://schemas.microsoft.com/office/word/2023/wordml/word16du" xmlns:oel="http://schemas.microsoft.com/office/2019/extlst">
             <w:pict>
               <v:group w14:anchorId="316EFDFB" id="Group 42" o:spid="_x0000_s1026" style="position:absolute;margin-left:42.75pt;margin-top:27.4pt;width:503.25pt;height:123pt;z-index:-15729664;mso-wrap-distance-left:0;mso-wrap-distance-right:0;mso-position-horizontal-relative:page;mso-width-relative:margin;mso-height-relative:margin" coordsize="65760,16560" o:gfxdata="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">
                 <v:shape id="Image 43" o:spid="_x0000_s1027" type="#_x0000_t75" style="position:absolute;left:95;top:95;width:65567;height:16371;visibility:visible;mso-wrap-style:square" o:gfxdata="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">
@@ -5287,7 +5341,7 @@
               </wp:anchor>
             </w:drawing>
           </mc:Choice>
-          <mc:Fallback>
+          <mc:Fallback xmlns:w16sdtfl="http://schemas.microsoft.com/office/word/2024/wordml/sdtformatlock" xmlns:w16du="http://schemas.microsoft.com/office/word/2023/wordml/word16du" xmlns:oel="http://schemas.microsoft.com/office/2019/extlst">
             <w:pict>
               <v:shape w14:anchorId="3F05B506" id="Graphic 55" o:spid="_x0000_s1026" style="position:absolute;margin-left:21.1pt;margin-top:-.25pt;width:1.45pt;height:22.2pt;z-index:15717888;visibility:visible;mso-wrap-style:square;mso-wrap-distance-left:0;mso-wrap-distance-top:0;mso-wrap-distance-right:0;mso-wrap-distance-bottom:0;mso-position-horizontal:absolute;mso-position-horizontal-relative:page;mso-position-vertical:absolute;mso-position-vertical-relative:text;v-text-anchor:top" coordsize="18415,281940" o:gfxdata="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" path="m18288,l,,,281940r18288,l18288,xe" fillcolor="#57b6c0" stroked="f">
                 <v:path arrowok="t"/>
@@ -5682,7 +5736,7 @@
               </wp:anchor>
             </w:drawing>
           </mc:Choice>
-          <mc:Fallback>
+          <mc:Fallback xmlns:w16sdtfl="http://schemas.microsoft.com/office/word/2024/wordml/sdtformatlock" xmlns:w16du="http://schemas.microsoft.com/office/word/2023/wordml/word16du" xmlns:oel="http://schemas.microsoft.com/office/2019/extlst">
             <w:pict>
               <v:shape w14:anchorId="148D6470" id="Graphic 70" o:spid="_x0000_s1026" style="position:absolute;margin-left:21.1pt;margin-top:-.25pt;width:1.45pt;height:22.2pt;z-index:15720960;visibility:visible;mso-wrap-style:square;mso-wrap-distance-left:0;mso-wrap-distance-top:0;mso-wrap-distance-right:0;mso-wrap-distance-bottom:0;mso-position-horizontal:absolute;mso-position-horizontal-relative:page;mso-position-vertical:absolute;mso-position-vertical-relative:text;v-text-anchor:top" coordsize="18415,281940" o:gfxdata="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" path="m18288,l,,,281940r18288,l18288,xe" fillcolor="#57b6c0" stroked="f">
                 <v:path arrowok="t"/>
@@ -6181,7 +6235,7 @@
               </wp:anchor>
             </w:drawing>
           </mc:Choice>
-          <mc:Fallback>
+          <mc:Fallback xmlns:w16sdtfl="http://schemas.microsoft.com/office/word/2024/wordml/sdtformatlock" xmlns:w16du="http://schemas.microsoft.com/office/word/2023/wordml/word16du" xmlns:oel="http://schemas.microsoft.com/office/2019/extlst">
             <w:pict>
               <v:shape w14:anchorId="17DFB580" id="Graphic 130" o:spid="_x0000_s1026" style="position:absolute;margin-left:21.1pt;margin-top:-.25pt;width:1.45pt;height:22.2pt;z-index:15723008;visibility:visible;mso-wrap-style:square;mso-wrap-distance-left:0;mso-wrap-distance-top:0;mso-wrap-distance-right:0;mso-wrap-distance-bottom:0;mso-position-horizontal:absolute;mso-position-horizontal-relative:page;mso-position-vertical:absolute;mso-position-vertical-relative:text;v-text-anchor:top" coordsize="18415,281940" o:gfxdata="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" path="m18288,l,,,281940r18288,l18288,xe" fillcolor="#57b6c0" stroked="f">
                 <v:path arrowok="t"/>
@@ -6489,7 +6543,7 @@
               </wp:anchor>
             </w:drawing>
           </mc:Choice>
-          <mc:Fallback>
+          <mc:Fallback xmlns:w16sdtfl="http://schemas.microsoft.com/office/word/2024/wordml/sdtformatlock" xmlns:w16du="http://schemas.microsoft.com/office/word/2023/wordml/word16du" xmlns:oel="http://schemas.microsoft.com/office/2019/extlst">
             <w:pict>
               <v:shape w14:anchorId="2C646F13" id="Graphic 141" o:spid="_x0000_s1026" style="position:absolute;margin-left:21.1pt;margin-top:16.85pt;width:1.45pt;height:22.2pt;z-index:-15719424;visibility:visible;mso-wrap-style:square;mso-wrap-distance-left:0;mso-wrap-distance-top:0;mso-wrap-distance-right:0;mso-wrap-distance-bottom:0;mso-position-horizontal:absolute;mso-position-horizontal-relative:page;mso-position-vertical:absolute;mso-position-vertical-relative:text;v-text-anchor:top" coordsize="18415,281940" o:gfxdata="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" path="m18288,l,,,281940r18288,l18288,xe" fillcolor="#57b6c0" stroked="f">
                 <v:path arrowok="t"/>
@@ -6646,7 +6700,7 @@
               </wp:anchor>
             </w:drawing>
           </mc:Choice>
-          <mc:Fallback>
+          <mc:Fallback xmlns:w16sdtfl="http://schemas.microsoft.com/office/word/2024/wordml/sdtformatlock" xmlns:w16du="http://schemas.microsoft.com/office/word/2023/wordml/word16du" xmlns:oel="http://schemas.microsoft.com/office/2019/extlst">
             <w:pict>
               <v:group w14:anchorId="5D1B400A" id="Group 142" o:spid="_x0000_s1026" style="position:absolute;margin-left:34.55pt;margin-top:16.85pt;width:526.3pt;height:22.35pt;z-index:-15718912;mso-wrap-distance-left:0;mso-wrap-distance-right:0;mso-position-horizontal-relative:page" coordsize="66840,2838" o:gfxdata="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">
                 <v:shape id="Graphic 143" o:spid="_x0000_s1027" style="position:absolute;width:66840;height:2819;visibility:visible;mso-wrap-style:square;v-text-anchor:top" coordsize="6684009,281940" o:gfxdata="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" path="m6684009,l,,,281940r6684009,l6684009,xe" fillcolor="#001f5f" stroked="f">
@@ -7055,6 +7109,7 @@
                 <w:szCs w:val="24"/>
               </w:rPr>
             </w:pPr>
+            <w:proofErr w:type="spellStart"/>
             <w:r>
               <w:rPr>
                 <w:rFonts w:asciiTheme="majorHAnsi" w:eastAsia="Cambria" w:hAnsiTheme="majorHAnsi" w:cstheme="majorHAnsi"/>
@@ -7066,6 +7121,7 @@
               </w:rPr>
               <w:t>Fibre</w:t>
             </w:r>
+            <w:proofErr w:type="spellEnd"/>
           </w:p>
         </w:tc>
         <w:tc>
@@ -7867,6 +7923,7 @@
                 <w:color w:val="000000"/>
               </w:rPr>
             </w:pPr>
+            <w:proofErr w:type="spellStart"/>
             <w:r>
               <w:rPr>
                 <w:rFonts w:eastAsia="Times New Roman" w:cs="Times New Roman"/>
@@ -7874,7 +7931,17 @@
                 <w:bCs/>
                 <w:color w:val="000000"/>
               </w:rPr>
-              <w:t>Monthy Rental without Taxes (LKR)</w:t>
+              <w:t>Monthy</w:t>
+            </w:r>
+            <w:proofErr w:type="spellEnd"/>
+            <w:r>
+              <w:rPr>
+                <w:rFonts w:eastAsia="Times New Roman" w:cs="Times New Roman"/>
+                <w:b/>
+                <w:bCs/>
+                <w:color w:val="000000"/>
+              </w:rPr>
+              <w:t xml:space="preserve"> Rental without Taxes (LKR)</w:t>
             </w:r>
           </w:p>
         </w:tc>
@@ -7912,8 +7979,17 @@
                 <w:rFonts w:eastAsia="Times New Roman" w:cs="Times New Roman"/>
                 <w:color w:val="000000"/>
               </w:rPr>
-              <w:t>Business Internet Line_BWB</w:t>
+              <w:t xml:space="preserve">Business Internet </w:t>
             </w:r>
+            <w:proofErr w:type="spellStart"/>
+            <w:r>
+              <w:rPr>
+                <w:rFonts w:eastAsia="Times New Roman" w:cs="Times New Roman"/>
+                <w:color w:val="000000"/>
+              </w:rPr>
+              <w:t>Line_BWB</w:t>
+            </w:r>
+            <w:proofErr w:type="spellEnd"/>
           </w:p>
         </w:tc>
         <w:tc>
@@ -8493,7 +8569,7 @@
               </wp:anchor>
             </w:drawing>
           </mc:Choice>
-          <mc:Fallback>
+          <mc:Fallback xmlns:w16sdtfl="http://schemas.microsoft.com/office/word/2024/wordml/sdtformatlock" xmlns:w16du="http://schemas.microsoft.com/office/word/2023/wordml/word16du" xmlns:oel="http://schemas.microsoft.com/office/2019/extlst">
             <w:pict>
               <v:shape w14:anchorId="4B9C33F9" id="Graphic 178" o:spid="_x0000_s1026" style="position:absolute;margin-left:21.1pt;margin-top:-.25pt;width:1.45pt;height:22.2pt;z-index:15732224;visibility:visible;mso-wrap-style:square;mso-wrap-distance-left:0;mso-wrap-distance-top:0;mso-wrap-distance-right:0;mso-wrap-distance-bottom:0;mso-position-horizontal:absolute;mso-position-horizontal-relative:page;mso-position-vertical:absolute;mso-position-vertical-relative:text;v-text-anchor:top" coordsize="18415,281940" o:gfxdata="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" path="m18288,l,,,281940r18288,l18288,xe" fillcolor="#57b6c0" stroked="f">
                 <v:path arrowok="t"/>
@@ -8833,7 +8909,27 @@
           <w:sz w:val="24"/>
           <w:szCs w:val="24"/>
         </w:rPr>
-        <w:t>Required LAN IP plan has to be submitted by the customer at the time of service request</w:t>
+        <w:t xml:space="preserve">Required LAN IP plan has to be submitted by the customer at the </w:t>
+      </w:r>
+      <w:proofErr w:type="gramStart"/>
+      <w:r>
+        <w:rPr>
+          <w:rFonts w:cs="Times New Roman"/>
+          <w:color w:val="EE0000"/>
+          <w:sz w:val="24"/>
+          <w:szCs w:val="24"/>
+        </w:rPr>
+        <w:t>time of service</w:t>
+      </w:r>
+      <w:proofErr w:type="gramEnd"/>
+      <w:r>
+        <w:rPr>
+          <w:rFonts w:cs="Times New Roman"/>
+          <w:color w:val="EE0000"/>
+          <w:sz w:val="24"/>
+          <w:szCs w:val="24"/>
+        </w:rPr>
+        <w:t xml:space="preserve"> request</w:t>
       </w:r>
     </w:p>
     <w:p>
@@ -9612,7 +9708,7 @@
               </wp:anchor>
             </w:drawing>
           </mc:Choice>
-          <mc:Fallback>
+          <mc:Fallback xmlns:w16sdtfl="http://schemas.microsoft.com/office/word/2024/wordml/sdtformatlock" xmlns:w16du="http://schemas.microsoft.com/office/word/2023/wordml/word16du" xmlns:oel="http://schemas.microsoft.com/office/2019/extlst">
             <w:pict>
               <v:shape w14:anchorId="1D28F3D4" id="Graphic 199" o:spid="_x0000_s1026" style="position:absolute;margin-left:21.1pt;margin-top:-.35pt;width:1.45pt;height:22.2pt;z-index:15735808;visibility:visible;mso-wrap-style:square;mso-wrap-distance-left:0;mso-wrap-distance-top:0;mso-wrap-distance-right:0;mso-wrap-distance-bottom:0;mso-position-horizontal:absolute;mso-position-horizontal-relative:page;mso-position-vertical:absolute;mso-position-vertical-relative:text;v-text-anchor:top" coordsize="18415,281940" o:gfxdata="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" path="m18288,l,,,281940r18288,l18288,xe" fillcolor="#57b6c0" stroked="f">
                 <v:path arrowok="t"/>
@@ -11798,7 +11894,7 @@
               </wp:anchor>
             </w:drawing>
           </mc:Choice>
-          <mc:Fallback>
+          <mc:Fallback xmlns:w16sdtfl="http://schemas.microsoft.com/office/word/2024/wordml/sdtformatlock" xmlns:w16du="http://schemas.microsoft.com/office/word/2023/wordml/word16du" xmlns:oel="http://schemas.microsoft.com/office/2019/extlst">
             <w:pict>
               <v:shape w14:anchorId="20133A7D" id="Graphic 211" o:spid="_x0000_s1026" style="position:absolute;margin-left:21.1pt;margin-top:-.25pt;width:1.45pt;height:22.2pt;z-index:15738880;visibility:visible;mso-wrap-style:square;mso-wrap-distance-left:0;mso-wrap-distance-top:0;mso-wrap-distance-right:0;mso-wrap-distance-bottom:0;mso-position-horizontal:absolute;mso-position-horizontal-relative:page;mso-position-vertical:absolute;mso-position-vertical-relative:text;v-text-anchor:top" coordsize="18415,281940" o:gfxdata="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" path="m18288,l,,,281940r18288,l18288,xe" fillcolor="#57b6c0" stroked="f">
                 <v:path arrowok="t"/>
@@ -12415,7 +12511,7 @@
               </wp:anchor>
             </w:drawing>
           </mc:Choice>
-          <mc:Fallback>
+          <mc:Fallback xmlns:w16sdtfl="http://schemas.microsoft.com/office/word/2024/wordml/sdtformatlock" xmlns:w16du="http://schemas.microsoft.com/office/word/2023/wordml/word16du" xmlns:oel="http://schemas.microsoft.com/office/2019/extlst">
             <w:pict>
               <v:shape w14:anchorId="32ADFAFC" id="Textbox 217" o:spid="_x0000_s1029" type="#_x0000_t202" style="position:absolute;left:0;text-align:left;margin-left:0;margin-top:19.05pt;width:526.3pt;height:22.2pt;z-index:251695616;visibility:visible;mso-wrap-style:square;mso-wrap-distance-left:9pt;mso-wrap-distance-top:0;mso-wrap-distance-right:9pt;mso-wrap-distance-bottom:0;mso-position-horizontal:center;mso-position-horizontal-relative:page;mso-position-vertical:absolute;mso-position-vertical-relative:text;v-text-anchor:top" o:gfxdata="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" fillcolor="#001f5f" stroked="f">
                 <v:textbox inset="0,0,0,0">
@@ -12532,7 +12628,7 @@
               </wp:anchor>
             </w:drawing>
           </mc:Choice>
-          <mc:Fallback>
+          <mc:Fallback xmlns:w16sdtfl="http://schemas.microsoft.com/office/word/2024/wordml/sdtformatlock" xmlns:w16du="http://schemas.microsoft.com/office/word/2023/wordml/word16du" xmlns:oel="http://schemas.microsoft.com/office/2019/extlst">
             <w:pict>
               <v:shape w14:anchorId="09174E6F" id="Textbox 213" o:spid="_x0000_s1030" type="#_x0000_t202" style="position:absolute;left:0;text-align:left;margin-left:36pt;margin-top:20.15pt;width:191.7pt;height:12.95pt;z-index:-251630080;visibility:visible;mso-wrap-style:square;mso-wrap-distance-left:0;mso-wrap-distance-top:0;mso-wrap-distance-right:0;mso-wrap-distance-bottom:0;mso-position-horizontal:absolute;mso-position-horizontal-relative:page;mso-position-vertical:absolute;mso-position-vertical-relative:text;v-text-anchor:top" o:gfxdata="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" filled="f" stroked="f">
                 <v:textbox inset="0,0,0,0">
@@ -12665,7 +12761,7 @@
               </wp:anchor>
             </w:drawing>
           </mc:Choice>
-          <mc:Fallback>
+          <mc:Fallback xmlns:w16sdtfl="http://schemas.microsoft.com/office/word/2024/wordml/sdtformatlock" xmlns:w16du="http://schemas.microsoft.com/office/word/2023/wordml/word16du" xmlns:oel="http://schemas.microsoft.com/office/2019/extlst">
             <w:pict>
               <v:shape w14:anchorId="21F82FFE" id="Graphic 214" o:spid="_x0000_s1026" style="position:absolute;margin-left:21.1pt;margin-top:16.85pt;width:1.45pt;height:22.2pt;z-index:-251623936;visibility:visible;mso-wrap-style:square;mso-wrap-distance-left:0;mso-wrap-distance-top:0;mso-wrap-distance-right:0;mso-wrap-distance-bottom:0;mso-position-horizontal:absolute;mso-position-horizontal-relative:page;mso-position-vertical:absolute;mso-position-vertical-relative:text;v-text-anchor:top" coordsize="18415,281940" o:gfxdata="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" path="m18288,l,,,281940r18288,l18288,xe" fillcolor="#57b6c0" stroked="f">
                 <v:path arrowok="t"/>
@@ -14463,7 +14559,11 @@
           </mc:Choice>
           <mc:Fallback>
             <w:pict>
-              <v:shape w14:anchorId="0599EEB5" id="Text Box 2" o:spid="_x0000_s1031" type="#_x0000_t202" style="position:absolute;margin-left:49pt;margin-top:6.4pt;width:213.4pt;height:111.4pt;z-index:487619584;visibility:visible;mso-wrap-style:square;mso-width-percent:0;mso-wrap-distance-left:9pt;mso-wrap-distance-top:0;mso-wrap-distance-right:9pt;mso-wrap-distance-bottom:0;mso-position-horizontal:absolute;mso-position-horizontal-relative:text;mso-position-vertical:absolute;mso-position-vertical-relative:text;mso-width-percent:0;mso-width-relative:margin;v-text-anchor:top" o:gfxdata="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" filled="f" stroked="f">
+              <v:shapetype w14:anchorId="0599EEB5" id="_x0000_t202" coordsize="21600,21600" o:spt="202" path="m,l,21600r21600,l21600,xe">
+                <v:stroke joinstyle="miter"/>
+                <v:path gradientshapeok="t" o:connecttype="rect"/>
+              </v:shapetype>
+              <v:shape id="Text Box 2" o:spid="_x0000_s1031" type="#_x0000_t202" style="position:absolute;margin-left:49pt;margin-top:6.4pt;width:213.4pt;height:111.4pt;z-index:487619584;visibility:visible;mso-wrap-style:square;mso-width-percent:0;mso-wrap-distance-left:9pt;mso-wrap-distance-top:0;mso-wrap-distance-right:9pt;mso-wrap-distance-bottom:0;mso-position-horizontal:absolute;mso-position-horizontal-relative:text;mso-position-vertical:absolute;mso-position-vertical-relative:text;mso-width-percent:0;mso-width-relative:margin;v-text-anchor:top" o:gfxdata="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" filled="f" stroked="f">
                 <v:textbox>
                   <w:txbxContent>
                     <w:p>
@@ -15007,7 +15107,7 @@
               </wp:anchor>
             </w:drawing>
           </mc:Choice>
-          <mc:Fallback>
+          <mc:Fallback xmlns:w16sdtfl="http://schemas.microsoft.com/office/word/2024/wordml/sdtformatlock" xmlns:w16du="http://schemas.microsoft.com/office/word/2023/wordml/word16du" xmlns:oel="http://schemas.microsoft.com/office/2019/extlst">
             <w:pict>
               <v:shape w14:anchorId="4DB15FD2" id="Textbox 246" o:spid="_x0000_s1032" type="#_x0000_t202" style="position:absolute;left:0;text-align:left;margin-left:36pt;margin-top:20.15pt;width:191.7pt;height:12.95pt;z-index:-16416768;visibility:visible;mso-wrap-style:square;mso-wrap-distance-left:0;mso-wrap-distance-top:0;mso-wrap-distance-right:0;mso-wrap-distance-bottom:0;mso-position-horizontal:absolute;mso-position-horizontal-relative:page;mso-position-vertical:absolute;mso-position-vertical-relative:text;v-text-anchor:top" o:gfxdata="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" filled="f" stroked="f">
                 <v:textbox inset="0,0,0,0">
@@ -15117,7 +15217,7 @@
               </wp:anchor>
             </w:drawing>
           </mc:Choice>
-          <mc:Fallback>
+          <mc:Fallback xmlns:w16sdtfl="http://schemas.microsoft.com/office/word/2024/wordml/sdtformatlock" xmlns:w16du="http://schemas.microsoft.com/office/word/2023/wordml/word16du" xmlns:oel="http://schemas.microsoft.com/office/2019/extlst">
             <w:pict>
               <v:group w14:anchorId="603BE5C8" id="Group 247" o:spid="_x0000_s1026" style="position:absolute;margin-left:0;margin-top:0;width:595.35pt;height:839.75pt;z-index:-16416256;mso-wrap-distance-left:0;mso-wrap-distance-right:0;mso-position-horizontal-relative:page;mso-position-vertical-relative:page" coordsize="75609,106648" o:gfxdata="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">
                 <v:shape id="Image 248" o:spid="_x0000_s1027" type="#_x0000_t75" style="position:absolute;width:75580;height:106648;visibility:visible;mso-wrap-style:square" o:gfxdata="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">
@@ -15364,7 +15464,7 @@
               </wp:anchor>
             </w:drawing>
           </mc:Choice>
-          <mc:Fallback>
+          <mc:Fallback xmlns:w16sdtfl="http://schemas.microsoft.com/office/word/2024/wordml/sdtformatlock" xmlns:w16du="http://schemas.microsoft.com/office/word/2023/wordml/word16du" xmlns:oel="http://schemas.microsoft.com/office/2019/extlst">
             <w:pict>
               <v:group w14:anchorId="15108F55" id="Group 250" o:spid="_x0000_s1033" style="position:absolute;left:0;text-align:left;margin-left:516.85pt;margin-top:781.45pt;width:78.5pt;height:58.8pt;z-index:15747584;mso-wrap-distance-left:0;mso-wrap-distance-right:0;mso-position-horizontal-relative:page;mso-position-vertical-relative:page" coordsize="9969,7467" o:gfxdata="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">
                 <v:shapetype id="_x0000_t75" coordsize="21600,21600" o:spt="75" o:preferrelative="t" path="m@4@5l@4@11@9@11@9@5xe" filled="f" stroked="f">
@@ -15861,7 +15961,7 @@
               </wp:anchor>
             </w:drawing>
           </mc:Choice>
-          <mc:Fallback>
+          <mc:Fallback xmlns:w16sdtfl="http://schemas.microsoft.com/office/word/2024/wordml/sdtformatlock" xmlns:w16du="http://schemas.microsoft.com/office/word/2023/wordml/word16du" xmlns:oel="http://schemas.microsoft.com/office/2019/extlst">
             <w:pict>
               <v:group w14:anchorId="30D0776D" id="Group 256" o:spid="_x0000_s1026" style="position:absolute;margin-left:0;margin-top:0;width:595.35pt;height:841.95pt;z-index:15748096;mso-wrap-distance-left:0;mso-wrap-distance-right:0;mso-position-horizontal-relative:page;mso-position-vertical-relative:page;mso-width-relative:margin;mso-height-relative:margin" coordsize="75605,106923" o:gfxdata="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">
                 <v:shape id="Image 257" o:spid="_x0000_s1027" type="#_x0000_t75" style="position:absolute;left:31343;top:87041;width:1403;height:1620;visibility:visible;mso-wrap-style:square" o:gfxdata="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">
@@ -16276,7 +16376,7 @@
 </file>
 
 <file path=word/endnotes.xml><?xml version="1.0" encoding="utf-8"?>
-<w:endnotes xmlns:wpc="http://schemas.microsoft.com/office/word/2010/wordprocessingCanvas" xmlns:cx="http://schemas.microsoft.com/office/drawing/2014/chartex" xmlns:cx1="http://schemas.microsoft.com/office/drawing/2015/9/8/chartex" xmlns:cx2="http://schemas.microsoft.com/office/drawing/2015/10/21/chartex" xmlns:cx3="http://schemas.microsoft.com/office/drawing/2016/5/9/chartex" xmlns:cx4="http://schemas.microsoft.com/office/drawing/2016/5/10/chartex" xmlns:cx5="http://schemas.microsoft.com/office/drawing/2016/5/11/chartex" xmlns:cx6="http://schemas.microsoft.com/office/drawing/2016/5/12/chartex" xmlns:cx7="http://schemas.microsoft.com/office/drawing/2016/5/13/chartex" xmlns:cx8="http://schemas.microsoft.com/office/drawing/2016/5/14/chartex" xmlns:mc="http://schemas.openxmlformats.org/markup-compatibility/2006" xmlns:aink="http://schemas.microsoft.com/office/drawing/2016/ink" xmlns:am3d="http://schemas.microsoft.com/office/drawing/2017/model3d" xmlns:o="urn:schemas-microsoft-com:office:office" xmlns:oel="http://schemas.microsoft.com/office/2019/extlst" xmlns:r="http://schemas.openxmlformats.org/officeDocument/2006/relationships" xmlns:m="http://schemas.openxmlformats.org/officeDocument/2006/math" xmlns:v="urn:schemas-microsoft-com:vml" xmlns:wp14="http://schemas.microsoft.com/office/word/2010/wordprocessingDrawing" xmlns:wp="http://schemas.openxmlformats.org/drawingml/2006/wordprocessingDrawing" xmlns:w10="urn:schemas-microsoft-com:office:word" xmlns:w="http://schemas.openxmlformats.org/wordprocessingml/2006/main" xmlns:w14="http://schemas.microsoft.com/office/word/2010/wordml" xmlns:w15="http://schemas.microsoft.com/office/word/2012/wordml" xmlns:w16cex="http://schemas.microsoft.com/office/word/2018/wordml/cex" xmlns:w16cid="http://schemas.microsoft.com/office/word/2016/wordml/cid" xmlns:w16="http://schemas.microsoft.com/office/word/2018/wordml" xmlns:w16du="http://schemas.microsoft.com/office/word/2023/wordml/word16du" xmlns:w16sdtdh="http://schemas.microsoft.com/office/word/2020/wordml/sdtdatahash" xmlns:w16sdtfl="http://schemas.microsoft.com/office/word/2024/wordml/sdtformatlock" xmlns:w16se="http://schemas.microsoft.com/office/word/2015/wordml/symex" xmlns:wpg="http://schemas.microsoft.com/office/word/2010/wordprocessingGroup" xmlns:wpi="http://schemas.microsoft.com/office/word/2010/wordprocessingInk" xmlns:wne="http://schemas.microsoft.com/office/word/2006/wordml" xmlns:wps="http://schemas.microsoft.com/office/word/2010/wordprocessingShape" mc:Ignorable="w14 w15 w16se w16cid w16 w16cex w16sdtdh w16sdtfl w16du wp14">
+<w:endnotes xmlns:wpc="http://schemas.microsoft.com/office/word/2010/wordprocessingCanvas" xmlns:cx="http://schemas.microsoft.com/office/drawing/2014/chartex" xmlns:cx1="http://schemas.microsoft.com/office/drawing/2015/9/8/chartex" xmlns:cx2="http://schemas.microsoft.com/office/drawing/2015/10/21/chartex" xmlns:cx3="http://schemas.microsoft.com/office/drawing/2016/5/9/chartex" xmlns:cx4="http://schemas.microsoft.com/office/drawing/2016/5/10/chartex" xmlns:cx5="http://schemas.microsoft.com/office/drawing/2016/5/11/chartex" xmlns:cx6="http://schemas.microsoft.com/office/drawing/2016/5/12/chartex" xmlns:cx7="http://schemas.microsoft.com/office/drawing/2016/5/13/chartex" xmlns:cx8="http://schemas.microsoft.com/office/drawing/2016/5/14/chartex" xmlns:mc="http://schemas.openxmlformats.org/markup-compatibility/2006" xmlns:aink="http://schemas.microsoft.com/office/drawing/2016/ink" xmlns:am3d="http://schemas.microsoft.com/office/drawing/2017/model3d" xmlns:o="urn:schemas-microsoft-com:office:office" xmlns:r="http://schemas.openxmlformats.org/officeDocument/2006/relationships" xmlns:m="http://schemas.openxmlformats.org/officeDocument/2006/math" xmlns:v="urn:schemas-microsoft-com:vml" xmlns:wp14="http://schemas.microsoft.com/office/word/2010/wordprocessingDrawing" xmlns:wp="http://schemas.openxmlformats.org/drawingml/2006/wordprocessingDrawing" xmlns:w10="urn:schemas-microsoft-com:office:word" xmlns:w="http://schemas.openxmlformats.org/wordprocessingml/2006/main" xmlns:w14="http://schemas.microsoft.com/office/word/2010/wordml" xmlns:w15="http://schemas.microsoft.com/office/word/2012/wordml" xmlns:w16cex="http://schemas.microsoft.com/office/word/2018/wordml/cex" xmlns:w16cid="http://schemas.microsoft.com/office/word/2016/wordml/cid" xmlns:w16="http://schemas.microsoft.com/office/word/2018/wordml" xmlns:w16sdtdh="http://schemas.microsoft.com/office/word/2020/wordml/sdtdatahash" xmlns:w16se="http://schemas.microsoft.com/office/word/2015/wordml/symex" xmlns:wpg="http://schemas.microsoft.com/office/word/2010/wordprocessingGroup" xmlns:wpi="http://schemas.microsoft.com/office/word/2010/wordprocessingInk" xmlns:wne="http://schemas.microsoft.com/office/word/2006/wordml" xmlns:wps="http://schemas.microsoft.com/office/word/2010/wordprocessingShape" mc:Ignorable="w14 w15 w16se w16cid w16 w16cex w16sdtdh wp14">
   <w:endnote w:type="separator" w:id="-1">
     <w:p>
       <w:r>
@@ -16295,7 +16395,7 @@
 </file>
 
 <file path=word/footer1.xml><?xml version="1.0" encoding="utf-8"?>
-<w:ftr xmlns:wpc="http://schemas.microsoft.com/office/word/2010/wordprocessingCanvas" xmlns:cx="http://schemas.microsoft.com/office/drawing/2014/chartex" xmlns:cx1="http://schemas.microsoft.com/office/drawing/2015/9/8/chartex" xmlns:cx2="http://schemas.microsoft.com/office/drawing/2015/10/21/chartex" xmlns:cx3="http://schemas.microsoft.com/office/drawing/2016/5/9/chartex" xmlns:cx4="http://schemas.microsoft.com/office/drawing/2016/5/10/chartex" xmlns:cx5="http://schemas.microsoft.com/office/drawing/2016/5/11/chartex" xmlns:cx6="http://schemas.microsoft.com/office/drawing/2016/5/12/chartex" xmlns:cx7="http://schemas.microsoft.com/office/drawing/2016/5/13/chartex" xmlns:cx8="http://schemas.microsoft.com/office/drawing/2016/5/14/chartex" xmlns:mc="http://schemas.openxmlformats.org/markup-compatibility/2006" xmlns:aink="http://schemas.microsoft.com/office/drawing/2016/ink" xmlns:am3d="http://schemas.microsoft.com/office/drawing/2017/model3d" xmlns:o="urn:schemas-microsoft-com:office:office" xmlns:oel="http://schemas.microsoft.com/office/2019/extlst" xmlns:r="http://schemas.openxmlformats.org/officeDocument/2006/relationships" xmlns:m="http://schemas.openxmlformats.org/officeDocument/2006/math" xmlns:v="urn:schemas-microsoft-com:vml" xmlns:wp14="http://schemas.microsoft.com/office/word/2010/wordprocessingDrawing" xmlns:wp="http://schemas.openxmlformats.org/drawingml/2006/wordprocessingDrawing" xmlns:w10="urn:schemas-microsoft-com:office:word" xmlns:w="http://schemas.openxmlformats.org/wordprocessingml/2006/main" xmlns:w14="http://schemas.microsoft.com/office/word/2010/wordml" xmlns:w15="http://schemas.microsoft.com/office/word/2012/wordml" xmlns:w16cex="http://schemas.microsoft.com/office/word/2018/wordml/cex" xmlns:w16cid="http://schemas.microsoft.com/office/word/2016/wordml/cid" xmlns:w16="http://schemas.microsoft.com/office/word/2018/wordml" xmlns:w16du="http://schemas.microsoft.com/office/word/2023/wordml/word16du" xmlns:w16sdtdh="http://schemas.microsoft.com/office/word/2020/wordml/sdtdatahash" xmlns:w16sdtfl="http://schemas.microsoft.com/office/word/2024/wordml/sdtformatlock" xmlns:w16se="http://schemas.microsoft.com/office/word/2015/wordml/symex" xmlns:wpg="http://schemas.microsoft.com/office/word/2010/wordprocessingGroup" xmlns:wpi="http://schemas.microsoft.com/office/word/2010/wordprocessingInk" xmlns:wne="http://schemas.microsoft.com/office/word/2006/wordml" xmlns:wps="http://schemas.microsoft.com/office/word/2010/wordprocessingShape" mc:Ignorable="w14 w15 w16se w16cid w16 w16cex w16sdtdh w16sdtfl w16du wp14">
+<w:ftr xmlns:wpc="http://schemas.microsoft.com/office/word/2010/wordprocessingCanvas" xmlns:cx="http://schemas.microsoft.com/office/drawing/2014/chartex" xmlns:cx1="http://schemas.microsoft.com/office/drawing/2015/9/8/chartex" xmlns:cx2="http://schemas.microsoft.com/office/drawing/2015/10/21/chartex" xmlns:cx3="http://schemas.microsoft.com/office/drawing/2016/5/9/chartex" xmlns:cx4="http://schemas.microsoft.com/office/drawing/2016/5/10/chartex" xmlns:cx5="http://schemas.microsoft.com/office/drawing/2016/5/11/chartex" xmlns:cx6="http://schemas.microsoft.com/office/drawing/2016/5/12/chartex" xmlns:cx7="http://schemas.microsoft.com/office/drawing/2016/5/13/chartex" xmlns:cx8="http://schemas.microsoft.com/office/drawing/2016/5/14/chartex" xmlns:mc="http://schemas.openxmlformats.org/markup-compatibility/2006" xmlns:aink="http://schemas.microsoft.com/office/drawing/2016/ink" xmlns:am3d="http://schemas.microsoft.com/office/drawing/2017/model3d" xmlns:o="urn:schemas-microsoft-com:office:office" xmlns:r="http://schemas.openxmlformats.org/officeDocument/2006/relationships" xmlns:m="http://schemas.openxmlformats.org/officeDocument/2006/math" xmlns:v="urn:schemas-microsoft-com:vml" xmlns:wp14="http://schemas.microsoft.com/office/word/2010/wordprocessingDrawing" xmlns:wp="http://schemas.openxmlformats.org/drawingml/2006/wordprocessingDrawing" xmlns:w10="urn:schemas-microsoft-com:office:word" xmlns:w="http://schemas.openxmlformats.org/wordprocessingml/2006/main" xmlns:w14="http://schemas.microsoft.com/office/word/2010/wordml" xmlns:w15="http://schemas.microsoft.com/office/word/2012/wordml" xmlns:w16cex="http://schemas.microsoft.com/office/word/2018/wordml/cex" xmlns:w16cid="http://schemas.microsoft.com/office/word/2016/wordml/cid" xmlns:w16="http://schemas.microsoft.com/office/word/2018/wordml" xmlns:w16sdtdh="http://schemas.microsoft.com/office/word/2020/wordml/sdtdatahash" xmlns:w16se="http://schemas.microsoft.com/office/word/2015/wordml/symex" xmlns:wpg="http://schemas.microsoft.com/office/word/2010/wordprocessingGroup" xmlns:wpi="http://schemas.microsoft.com/office/word/2010/wordprocessingInk" xmlns:wne="http://schemas.microsoft.com/office/word/2006/wordml" xmlns:wps="http://schemas.microsoft.com/office/word/2010/wordprocessingShape" mc:Ignorable="w14 w15 w16se w16cid w16 w16cex w16sdtdh wp14">
   <w:p>
     <w:pPr>
       <w:pStyle w:val="Footer"/>
@@ -16606,7 +16706,7 @@
             </wp:anchor>
           </w:drawing>
         </mc:Choice>
-        <mc:Fallback>
+        <mc:Fallback xmlns:w16sdtfl="http://schemas.microsoft.com/office/word/2024/wordml/sdtformatlock" xmlns:w16du="http://schemas.microsoft.com/office/word/2023/wordml/word16du" xmlns:oel="http://schemas.microsoft.com/office/2019/extlst">
           <w:pict>
             <v:group w14:anchorId="11005D2B" id="Group 49" o:spid="_x0000_s1039" style="position:absolute;margin-left:517.5pt;margin-top:5.25pt;width:78.5pt;height:58.8pt;z-index:251665920" coordsize="9966,7464" o:gfxdata="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">
               <v:shapetype id="_x0000_t75" coordsize="21600,21600" o:spt="75" o:preferrelative="t" path="m@4@5l@4@11@9@11@9@5xe" filled="f" stroked="f">
@@ -17052,7 +17152,7 @@
             </wp:anchor>
           </w:drawing>
         </mc:Choice>
-        <mc:Fallback>
+        <mc:Fallback xmlns:w16sdtfl="http://schemas.microsoft.com/office/word/2024/wordml/sdtformatlock" xmlns:w16du="http://schemas.microsoft.com/office/word/2023/wordml/word16du" xmlns:oel="http://schemas.microsoft.com/office/2019/extlst">
           <w:pict>
             <v:shape w14:anchorId="115347EE" id="_x0000_s1045" type="#_x0000_t202" style="position:absolute;margin-left:99.75pt;margin-top:.85pt;width:446.25pt;height:21pt;z-index:251671040;visibility:visible;mso-wrap-style:square;mso-width-percent:0;mso-height-percent:0;mso-wrap-distance-left:9pt;mso-wrap-distance-top:3.6pt;mso-wrap-distance-right:9pt;mso-wrap-distance-bottom:3.6pt;mso-position-horizontal:absolute;mso-position-horizontal-relative:text;mso-position-vertical:absolute;mso-position-vertical-relative:text;mso-width-percent:0;mso-height-percent:0;mso-width-relative:margin;mso-height-relative:margin;v-text-anchor:top" o:gfxdata="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" filled="f" stroked="f">
               <v:textbox>
@@ -17338,7 +17438,7 @@
 </file>
 
 <file path=word/footnotes.xml><?xml version="1.0" encoding="utf-8"?>
-<w:footnotes xmlns:wpc="http://schemas.microsoft.com/office/word/2010/wordprocessingCanvas" xmlns:cx="http://schemas.microsoft.com/office/drawing/2014/chartex" xmlns:cx1="http://schemas.microsoft.com/office/drawing/2015/9/8/chartex" xmlns:cx2="http://schemas.microsoft.com/office/drawing/2015/10/21/chartex" xmlns:cx3="http://schemas.microsoft.com/office/drawing/2016/5/9/chartex" xmlns:cx4="http://schemas.microsoft.com/office/drawing/2016/5/10/chartex" xmlns:cx5="http://schemas.microsoft.com/office/drawing/2016/5/11/chartex" xmlns:cx6="http://schemas.microsoft.com/office/drawing/2016/5/12/chartex" xmlns:cx7="http://schemas.microsoft.com/office/drawing/2016/5/13/chartex" xmlns:cx8="http://schemas.microsoft.com/office/drawing/2016/5/14/chartex" xmlns:mc="http://schemas.openxmlformats.org/markup-compatibility/2006" xmlns:aink="http://schemas.microsoft.com/office/drawing/2016/ink" xmlns:am3d="http://schemas.microsoft.com/office/drawing/2017/model3d" xmlns:o="urn:schemas-microsoft-com:office:office" xmlns:oel="http://schemas.microsoft.com/office/2019/extlst" xmlns:r="http://schemas.openxmlformats.org/officeDocument/2006/relationships" xmlns:m="http://schemas.openxmlformats.org/officeDocument/2006/math" xmlns:v="urn:schemas-microsoft-com:vml" xmlns:wp14="http://schemas.microsoft.com/office/word/2010/wordprocessingDrawing" xmlns:wp="http://schemas.openxmlformats.org/drawingml/2006/wordprocessingDrawing" xmlns:w10="urn:schemas-microsoft-com:office:word" xmlns:w="http://schemas.openxmlformats.org/wordprocessingml/2006/main" xmlns:w14="http://schemas.microsoft.com/office/word/2010/wordml" xmlns:w15="http://schemas.microsoft.com/office/word/2012/wordml" xmlns:w16cex="http://schemas.microsoft.com/office/word/2018/wordml/cex" xmlns:w16cid="http://schemas.microsoft.com/office/word/2016/wordml/cid" xmlns:w16="http://schemas.microsoft.com/office/word/2018/wordml" xmlns:w16du="http://schemas.microsoft.com/office/word/2023/wordml/word16du" xmlns:w16sdtdh="http://schemas.microsoft.com/office/word/2020/wordml/sdtdatahash" xmlns:w16sdtfl="http://schemas.microsoft.com/office/word/2024/wordml/sdtformatlock" xmlns:w16se="http://schemas.microsoft.com/office/word/2015/wordml/symex" xmlns:wpg="http://schemas.microsoft.com/office/word/2010/wordprocessingGroup" xmlns:wpi="http://schemas.microsoft.com/office/word/2010/wordprocessingInk" xmlns:wne="http://schemas.microsoft.com/office/word/2006/wordml" xmlns:wps="http://schemas.microsoft.com/office/word/2010/wordprocessingShape" mc:Ignorable="w14 w15 w16se w16cid w16 w16cex w16sdtdh w16sdtfl w16du wp14">
+<w:footnotes xmlns:wpc="http://schemas.microsoft.com/office/word/2010/wordprocessingCanvas" xmlns:cx="http://schemas.microsoft.com/office/drawing/2014/chartex" xmlns:cx1="http://schemas.microsoft.com/office/drawing/2015/9/8/chartex" xmlns:cx2="http://schemas.microsoft.com/office/drawing/2015/10/21/chartex" xmlns:cx3="http://schemas.microsoft.com/office/drawing/2016/5/9/chartex" xmlns:cx4="http://schemas.microsoft.com/office/drawing/2016/5/10/chartex" xmlns:cx5="http://schemas.microsoft.com/office/drawing/2016/5/11/chartex" xmlns:cx6="http://schemas.microsoft.com/office/drawing/2016/5/12/chartex" xmlns:cx7="http://schemas.microsoft.com/office/drawing/2016/5/13/chartex" xmlns:cx8="http://schemas.microsoft.com/office/drawing/2016/5/14/chartex" xmlns:mc="http://schemas.openxmlformats.org/markup-compatibility/2006" xmlns:aink="http://schemas.microsoft.com/office/drawing/2016/ink" xmlns:am3d="http://schemas.microsoft.com/office/drawing/2017/model3d" xmlns:o="urn:schemas-microsoft-com:office:office" xmlns:r="http://schemas.openxmlformats.org/officeDocument/2006/relationships" xmlns:m="http://schemas.openxmlformats.org/officeDocument/2006/math" xmlns:v="urn:schemas-microsoft-com:vml" xmlns:wp14="http://schemas.microsoft.com/office/word/2010/wordprocessingDrawing" xmlns:wp="http://schemas.openxmlformats.org/drawingml/2006/wordprocessingDrawing" xmlns:w10="urn:schemas-microsoft-com:office:word" xmlns:w="http://schemas.openxmlformats.org/wordprocessingml/2006/main" xmlns:w14="http://schemas.microsoft.com/office/word/2010/wordml" xmlns:w15="http://schemas.microsoft.com/office/word/2012/wordml" xmlns:w16cex="http://schemas.microsoft.com/office/word/2018/wordml/cex" xmlns:w16cid="http://schemas.microsoft.com/office/word/2016/wordml/cid" xmlns:w16="http://schemas.microsoft.com/office/word/2018/wordml" xmlns:w16sdtdh="http://schemas.microsoft.com/office/word/2020/wordml/sdtdatahash" xmlns:w16se="http://schemas.microsoft.com/office/word/2015/wordml/symex" xmlns:wpg="http://schemas.microsoft.com/office/word/2010/wordprocessingGroup" xmlns:wpi="http://schemas.microsoft.com/office/word/2010/wordprocessingInk" xmlns:wne="http://schemas.microsoft.com/office/word/2006/wordml" xmlns:wps="http://schemas.microsoft.com/office/word/2010/wordprocessingShape" mc:Ignorable="w14 w15 w16se w16cid w16 w16cex w16sdtdh wp14">
   <w:footnote w:type="separator" w:id="-1">
     <w:p>
       <w:r>
@@ -17357,7 +17457,7 @@
 </file>
 
 <file path=word/header1.xml><?xml version="1.0" encoding="utf-8"?>
-<w:hdr xmlns:wpc="http://schemas.microsoft.com/office/word/2010/wordprocessingCanvas" xmlns:cx="http://schemas.microsoft.com/office/drawing/2014/chartex" xmlns:cx1="http://schemas.microsoft.com/office/drawing/2015/9/8/chartex" xmlns:cx2="http://schemas.microsoft.com/office/drawing/2015/10/21/chartex" xmlns:cx3="http://schemas.microsoft.com/office/drawing/2016/5/9/chartex" xmlns:cx4="http://schemas.microsoft.com/office/drawing/2016/5/10/chartex" xmlns:cx5="http://schemas.microsoft.com/office/drawing/2016/5/11/chartex" xmlns:cx6="http://schemas.microsoft.com/office/drawing/2016/5/12/chartex" xmlns:cx7="http://schemas.microsoft.com/office/drawing/2016/5/13/chartex" xmlns:cx8="http://schemas.microsoft.com/office/drawing/2016/5/14/chartex" xmlns:mc="http://schemas.openxmlformats.org/markup-compatibility/2006" xmlns:aink="http://schemas.microsoft.com/office/drawing/2016/ink" xmlns:am3d="http://schemas.microsoft.com/office/drawing/2017/model3d" xmlns:o="urn:schemas-microsoft-com:office:office" xmlns:oel="http://schemas.microsoft.com/office/2019/extlst" xmlns:r="http://schemas.openxmlformats.org/officeDocument/2006/relationships" xmlns:m="http://schemas.openxmlformats.org/officeDocument/2006/math" xmlns:v="urn:schemas-microsoft-com:vml" xmlns:wp14="http://schemas.microsoft.com/office/word/2010/wordprocessingDrawing" xmlns:wp="http://schemas.openxmlformats.org/drawingml/2006/wordprocessingDrawing" xmlns:w10="urn:schemas-microsoft-com:office:word" xmlns:w="http://schemas.openxmlformats.org/wordprocessingml/2006/main" xmlns:w14="http://schemas.microsoft.com/office/word/2010/wordml" xmlns:w15="http://schemas.microsoft.com/office/word/2012/wordml" xmlns:w16cex="http://schemas.microsoft.com/office/word/2018/wordml/cex" xmlns:w16cid="http://schemas.microsoft.com/office/word/2016/wordml/cid" xmlns:w16="http://schemas.microsoft.com/office/word/2018/wordml" xmlns:w16du="http://schemas.microsoft.com/office/word/2023/wordml/word16du" xmlns:w16sdtdh="http://schemas.microsoft.com/office/word/2020/wordml/sdtdatahash" xmlns:w16sdtfl="http://schemas.microsoft.com/office/word/2024/wordml/sdtformatlock" xmlns:w16se="http://schemas.microsoft.com/office/word/2015/wordml/symex" xmlns:wpg="http://schemas.microsoft.com/office/word/2010/wordprocessingGroup" xmlns:wpi="http://schemas.microsoft.com/office/word/2010/wordprocessingInk" xmlns:wne="http://schemas.microsoft.com/office/word/2006/wordml" xmlns:wps="http://schemas.microsoft.com/office/word/2010/wordprocessingShape" mc:Ignorable="w14 w15 w16se w16cid w16 w16cex w16sdtdh w16sdtfl w16du wp14">
+<w:hdr xmlns:wpc="http://schemas.microsoft.com/office/word/2010/wordprocessingCanvas" xmlns:cx="http://schemas.microsoft.com/office/drawing/2014/chartex" xmlns:cx1="http://schemas.microsoft.com/office/drawing/2015/9/8/chartex" xmlns:cx2="http://schemas.microsoft.com/office/drawing/2015/10/21/chartex" xmlns:cx3="http://schemas.microsoft.com/office/drawing/2016/5/9/chartex" xmlns:cx4="http://schemas.microsoft.com/office/drawing/2016/5/10/chartex" xmlns:cx5="http://schemas.microsoft.com/office/drawing/2016/5/11/chartex" xmlns:cx6="http://schemas.microsoft.com/office/drawing/2016/5/12/chartex" xmlns:cx7="http://schemas.microsoft.com/office/drawing/2016/5/13/chartex" xmlns:cx8="http://schemas.microsoft.com/office/drawing/2016/5/14/chartex" xmlns:mc="http://schemas.openxmlformats.org/markup-compatibility/2006" xmlns:aink="http://schemas.microsoft.com/office/drawing/2016/ink" xmlns:am3d="http://schemas.microsoft.com/office/drawing/2017/model3d" xmlns:o="urn:schemas-microsoft-com:office:office" xmlns:r="http://schemas.openxmlformats.org/officeDocument/2006/relationships" xmlns:m="http://schemas.openxmlformats.org/officeDocument/2006/math" xmlns:v="urn:schemas-microsoft-com:vml" xmlns:wp14="http://schemas.microsoft.com/office/word/2010/wordprocessingDrawing" xmlns:wp="http://schemas.openxmlformats.org/drawingml/2006/wordprocessingDrawing" xmlns:w10="urn:schemas-microsoft-com:office:word" xmlns:w="http://schemas.openxmlformats.org/wordprocessingml/2006/main" xmlns:w14="http://schemas.microsoft.com/office/word/2010/wordml" xmlns:w15="http://schemas.microsoft.com/office/word/2012/wordml" xmlns:w16cex="http://schemas.microsoft.com/office/word/2018/wordml/cex" xmlns:w16cid="http://schemas.microsoft.com/office/word/2016/wordml/cid" xmlns:w16="http://schemas.microsoft.com/office/word/2018/wordml" xmlns:w16sdtdh="http://schemas.microsoft.com/office/word/2020/wordml/sdtdatahash" xmlns:w16se="http://schemas.microsoft.com/office/word/2015/wordml/symex" xmlns:wpg="http://schemas.microsoft.com/office/word/2010/wordprocessingGroup" xmlns:wpi="http://schemas.microsoft.com/office/word/2010/wordprocessingInk" xmlns:wne="http://schemas.microsoft.com/office/word/2006/wordml" xmlns:wps="http://schemas.microsoft.com/office/word/2010/wordprocessingShape" mc:Ignorable="w14 w15 w16se w16cid w16 w16cex w16sdtdh wp14">
   <w:p>
     <w:pPr>
       <w:pStyle w:val="Header"/>
@@ -17417,7 +17517,7 @@
 </file>
 
 <file path=word/header2.xml><?xml version="1.0" encoding="utf-8"?>
-<w:hdr xmlns:wpc="http://schemas.microsoft.com/office/word/2010/wordprocessingCanvas" xmlns:cx="http://schemas.microsoft.com/office/drawing/2014/chartex" xmlns:cx1="http://schemas.microsoft.com/office/drawing/2015/9/8/chartex" xmlns:cx2="http://schemas.microsoft.com/office/drawing/2015/10/21/chartex" xmlns:cx3="http://schemas.microsoft.com/office/drawing/2016/5/9/chartex" xmlns:cx4="http://schemas.microsoft.com/office/drawing/2016/5/10/chartex" xmlns:cx5="http://schemas.microsoft.com/office/drawing/2016/5/11/chartex" xmlns:cx6="http://schemas.microsoft.com/office/drawing/2016/5/12/chartex" xmlns:cx7="http://schemas.microsoft.com/office/drawing/2016/5/13/chartex" xmlns:cx8="http://schemas.microsoft.com/office/drawing/2016/5/14/chartex" xmlns:mc="http://schemas.openxmlformats.org/markup-compatibility/2006" xmlns:aink="http://schemas.microsoft.com/office/drawing/2016/ink" xmlns:am3d="http://schemas.microsoft.com/office/drawing/2017/model3d" xmlns:o="urn:schemas-microsoft-com:office:office" xmlns:oel="http://schemas.microsoft.com/office/2019/extlst" xmlns:r="http://schemas.openxmlformats.org/officeDocument/2006/relationships" xmlns:m="http://schemas.openxmlformats.org/officeDocument/2006/math" xmlns:v="urn:schemas-microsoft-com:vml" xmlns:wp14="http://schemas.microsoft.com/office/word/2010/wordprocessingDrawing" xmlns:wp="http://schemas.openxmlformats.org/drawingml/2006/wordprocessingDrawing" xmlns:w10="urn:schemas-microsoft-com:office:word" xmlns:w="http://schemas.openxmlformats.org/wordprocessingml/2006/main" xmlns:w14="http://schemas.microsoft.com/office/word/2010/wordml" xmlns:w15="http://schemas.microsoft.com/office/word/2012/wordml" xmlns:w16cex="http://schemas.microsoft.com/office/word/2018/wordml/cex" xmlns:w16cid="http://schemas.microsoft.com/office/word/2016/wordml/cid" xmlns:w16="http://schemas.microsoft.com/office/word/2018/wordml" xmlns:w16du="http://schemas.microsoft.com/office/word/2023/wordml/word16du" xmlns:w16sdtdh="http://schemas.microsoft.com/office/word/2020/wordml/sdtdatahash" xmlns:w16sdtfl="http://schemas.microsoft.com/office/word/2024/wordml/sdtformatlock" xmlns:w16se="http://schemas.microsoft.com/office/word/2015/wordml/symex" xmlns:wpg="http://schemas.microsoft.com/office/word/2010/wordprocessingGroup" xmlns:wpi="http://schemas.microsoft.com/office/word/2010/wordprocessingInk" xmlns:wne="http://schemas.microsoft.com/office/word/2006/wordml" xmlns:wps="http://schemas.microsoft.com/office/word/2010/wordprocessingShape" mc:Ignorable="w14 w15 w16se w16cid w16 w16cex w16sdtdh w16sdtfl w16du wp14">
+<w:hdr xmlns:wpc="http://schemas.microsoft.com/office/word/2010/wordprocessingCanvas" xmlns:cx="http://schemas.microsoft.com/office/drawing/2014/chartex" xmlns:cx1="http://schemas.microsoft.com/office/drawing/2015/9/8/chartex" xmlns:cx2="http://schemas.microsoft.com/office/drawing/2015/10/21/chartex" xmlns:cx3="http://schemas.microsoft.com/office/drawing/2016/5/9/chartex" xmlns:cx4="http://schemas.microsoft.com/office/drawing/2016/5/10/chartex" xmlns:cx5="http://schemas.microsoft.com/office/drawing/2016/5/11/chartex" xmlns:cx6="http://schemas.microsoft.com/office/drawing/2016/5/12/chartex" xmlns:cx7="http://schemas.microsoft.com/office/drawing/2016/5/13/chartex" xmlns:cx8="http://schemas.microsoft.com/office/drawing/2016/5/14/chartex" xmlns:mc="http://schemas.openxmlformats.org/markup-compatibility/2006" xmlns:aink="http://schemas.microsoft.com/office/drawing/2016/ink" xmlns:am3d="http://schemas.microsoft.com/office/drawing/2017/model3d" xmlns:o="urn:schemas-microsoft-com:office:office" xmlns:r="http://schemas.openxmlformats.org/officeDocument/2006/relationships" xmlns:m="http://schemas.openxmlformats.org/officeDocument/2006/math" xmlns:v="urn:schemas-microsoft-com:vml" xmlns:wp14="http://schemas.microsoft.com/office/word/2010/wordprocessingDrawing" xmlns:wp="http://schemas.openxmlformats.org/drawingml/2006/wordprocessingDrawing" xmlns:w10="urn:schemas-microsoft-com:office:word" xmlns:w="http://schemas.openxmlformats.org/wordprocessingml/2006/main" xmlns:w14="http://schemas.microsoft.com/office/word/2010/wordml" xmlns:w15="http://schemas.microsoft.com/office/word/2012/wordml" xmlns:w16cex="http://schemas.microsoft.com/office/word/2018/wordml/cex" xmlns:w16cid="http://schemas.microsoft.com/office/word/2016/wordml/cid" xmlns:w16="http://schemas.microsoft.com/office/word/2018/wordml" xmlns:w16sdtdh="http://schemas.microsoft.com/office/word/2020/wordml/sdtdatahash" xmlns:w16se="http://schemas.microsoft.com/office/word/2015/wordml/symex" xmlns:wpg="http://schemas.microsoft.com/office/word/2010/wordprocessingGroup" xmlns:wpi="http://schemas.microsoft.com/office/word/2010/wordprocessingInk" xmlns:wne="http://schemas.microsoft.com/office/word/2006/wordml" xmlns:wps="http://schemas.microsoft.com/office/word/2010/wordprocessingShape" mc:Ignorable="w14 w15 w16se w16cid w16 w16cex w16sdtdh wp14">
   <w:p>
     <w:pPr>
       <w:pStyle w:val="Header"/>
@@ -17487,7 +17587,7 @@
 </file>
 
 <file path=word/numbering.xml><?xml version="1.0" encoding="utf-8"?>
-<w:numbering xmlns:wpc="http://schemas.microsoft.com/office/word/2010/wordprocessingCanvas" xmlns:cx="http://schemas.microsoft.com/office/drawing/2014/chartex" xmlns:cx1="http://schemas.microsoft.com/office/drawing/2015/9/8/chartex" xmlns:cx2="http://schemas.microsoft.com/office/drawing/2015/10/21/chartex" xmlns:cx3="http://schemas.microsoft.com/office/drawing/2016/5/9/chartex" xmlns:cx4="http://schemas.microsoft.com/office/drawing/2016/5/10/chartex" xmlns:cx5="http://schemas.microsoft.com/office/drawing/2016/5/11/chartex" xmlns:cx6="http://schemas.microsoft.com/office/drawing/2016/5/12/chartex" xmlns:cx7="http://schemas.microsoft.com/office/drawing/2016/5/13/chartex" xmlns:cx8="http://schemas.microsoft.com/office/drawing/2016/5/14/chartex" xmlns:mc="http://schemas.openxmlformats.org/markup-compatibility/2006" xmlns:aink="http://schemas.microsoft.com/office/drawing/2016/ink" xmlns:am3d="http://schemas.microsoft.com/office/drawing/2017/model3d" xmlns:o="urn:schemas-microsoft-com:office:office" xmlns:oel="http://schemas.microsoft.com/office/2019/extlst" xmlns:r="http://schemas.openxmlformats.org/officeDocument/2006/relationships" xmlns:m="http://schemas.openxmlformats.org/officeDocument/2006/math" xmlns:v="urn:schemas-microsoft-com:vml" xmlns:wp14="http://schemas.microsoft.com/office/word/2010/wordprocessingDrawing" xmlns:wp="http://schemas.openxmlformats.org/drawingml/2006/wordprocessingDrawing" xmlns:w10="urn:schemas-microsoft-com:office:word" xmlns:w="http://schemas.openxmlformats.org/wordprocessingml/2006/main" xmlns:w14="http://schemas.microsoft.com/office/word/2010/wordml" xmlns:w15="http://schemas.microsoft.com/office/word/2012/wordml" xmlns:w16cex="http://schemas.microsoft.com/office/word/2018/wordml/cex" xmlns:w16cid="http://schemas.microsoft.com/office/word/2016/wordml/cid" xmlns:w16="http://schemas.microsoft.com/office/word/2018/wordml" xmlns:w16du="http://schemas.microsoft.com/office/word/2023/wordml/word16du" xmlns:w16sdtdh="http://schemas.microsoft.com/office/word/2020/wordml/sdtdatahash" xmlns:w16sdtfl="http://schemas.microsoft.com/office/word/2024/wordml/sdtformatlock" xmlns:w16se="http://schemas.microsoft.com/office/word/2015/wordml/symex" xmlns:wpg="http://schemas.microsoft.com/office/word/2010/wordprocessingGroup" xmlns:wpi="http://schemas.microsoft.com/office/word/2010/wordprocessingInk" xmlns:wne="http://schemas.microsoft.com/office/word/2006/wordml" xmlns:wps="http://schemas.microsoft.com/office/word/2010/wordprocessingShape" mc:Ignorable="w14 w15 w16se w16cid w16 w16cex w16sdtdh w16sdtfl w16du wp14">
+<w:numbering xmlns:wpc="http://schemas.microsoft.com/office/word/2010/wordprocessingCanvas" xmlns:cx="http://schemas.microsoft.com/office/drawing/2014/chartex" xmlns:cx1="http://schemas.microsoft.com/office/drawing/2015/9/8/chartex" xmlns:cx2="http://schemas.microsoft.com/office/drawing/2015/10/21/chartex" xmlns:cx3="http://schemas.microsoft.com/office/drawing/2016/5/9/chartex" xmlns:cx4="http://schemas.microsoft.com/office/drawing/2016/5/10/chartex" xmlns:cx5="http://schemas.microsoft.com/office/drawing/2016/5/11/chartex" xmlns:cx6="http://schemas.microsoft.com/office/drawing/2016/5/12/chartex" xmlns:cx7="http://schemas.microsoft.com/office/drawing/2016/5/13/chartex" xmlns:cx8="http://schemas.microsoft.com/office/drawing/2016/5/14/chartex" xmlns:mc="http://schemas.openxmlformats.org/markup-compatibility/2006" xmlns:aink="http://schemas.microsoft.com/office/drawing/2016/ink" xmlns:am3d="http://schemas.microsoft.com/office/drawing/2017/model3d" xmlns:o="urn:schemas-microsoft-com:office:office" xmlns:r="http://schemas.openxmlformats.org/officeDocument/2006/relationships" xmlns:m="http://schemas.openxmlformats.org/officeDocument/2006/math" xmlns:v="urn:schemas-microsoft-com:vml" xmlns:wp14="http://schemas.microsoft.com/office/word/2010/wordprocessingDrawing" xmlns:wp="http://schemas.openxmlformats.org/drawingml/2006/wordprocessingDrawing" xmlns:w10="urn:schemas-microsoft-com:office:word" xmlns:w="http://schemas.openxmlformats.org/wordprocessingml/2006/main" xmlns:w14="http://schemas.microsoft.com/office/word/2010/wordml" xmlns:w15="http://schemas.microsoft.com/office/word/2012/wordml" xmlns:w16cex="http://schemas.microsoft.com/office/word/2018/wordml/cex" xmlns:w16cid="http://schemas.microsoft.com/office/word/2016/wordml/cid" xmlns:w16="http://schemas.microsoft.com/office/word/2018/wordml" xmlns:w16sdtdh="http://schemas.microsoft.com/office/word/2020/wordml/sdtdatahash" xmlns:w16se="http://schemas.microsoft.com/office/word/2015/wordml/symex" xmlns:wpg="http://schemas.microsoft.com/office/word/2010/wordprocessingGroup" xmlns:wpi="http://schemas.microsoft.com/office/word/2010/wordprocessingInk" xmlns:wne="http://schemas.microsoft.com/office/word/2006/wordml" xmlns:wps="http://schemas.microsoft.com/office/word/2010/wordprocessingShape" mc:Ignorable="w14 w15 w16se w16cid w16 w16cex w16sdtdh wp14">
   <w:abstractNum w:abstractNumId="0" w15:restartNumberingAfterBreak="0">
     <w:nsid w:val="2D4E4AB7"/>
     <w:multiLevelType w:val="hybridMultilevel"/>
@@ -17919,23 +18019,23 @@
       </w:rPr>
     </w:lvl>
   </w:abstractNum>
-  <w:num w:numId="1" w16cid:durableId="211963218">
+  <w:num w:numId="1">
     <w:abstractNumId w:val="2"/>
   </w:num>
-  <w:num w:numId="2" w16cid:durableId="1236932071">
+  <w:num w:numId="2">
     <w:abstractNumId w:val="3"/>
   </w:num>
-  <w:num w:numId="3" w16cid:durableId="1750736564">
+  <w:num w:numId="3">
     <w:abstractNumId w:val="0"/>
   </w:num>
-  <w:num w:numId="4" w16cid:durableId="1605572763">
+  <w:num w:numId="4">
     <w:abstractNumId w:val="1"/>
   </w:num>
 </w:numbering>
 </file>
 
 <file path=word/styles.xml><?xml version="1.0" encoding="utf-8"?>
-<w:styles xmlns:mc="http://schemas.openxmlformats.org/markup-compatibility/2006" xmlns:r="http://schemas.openxmlformats.org/officeDocument/2006/relationships" xmlns:w="http://schemas.openxmlformats.org/wordprocessingml/2006/main" xmlns:w14="http://schemas.microsoft.com/office/word/2010/wordml" xmlns:w15="http://schemas.microsoft.com/office/word/2012/wordml" xmlns:w16cex="http://schemas.microsoft.com/office/word/2018/wordml/cex" xmlns:w16cid="http://schemas.microsoft.com/office/word/2016/wordml/cid" xmlns:w16="http://schemas.microsoft.com/office/word/2018/wordml" xmlns:w16du="http://schemas.microsoft.com/office/word/2023/wordml/word16du" xmlns:w16sdtdh="http://schemas.microsoft.com/office/word/2020/wordml/sdtdatahash" xmlns:w16sdtfl="http://schemas.microsoft.com/office/word/2024/wordml/sdtformatlock" xmlns:w16se="http://schemas.microsoft.com/office/word/2015/wordml/symex" mc:Ignorable="w14 w15 w16se w16cid w16 w16cex w16sdtdh w16sdtfl w16du">
+<w:styles xmlns:mc="http://schemas.openxmlformats.org/markup-compatibility/2006" xmlns:r="http://schemas.openxmlformats.org/officeDocument/2006/relationships" xmlns:w="http://schemas.openxmlformats.org/wordprocessingml/2006/main" xmlns:w14="http://schemas.microsoft.com/office/word/2010/wordml" xmlns:w15="http://schemas.microsoft.com/office/word/2012/wordml" xmlns:w16cex="http://schemas.microsoft.com/office/word/2018/wordml/cex" xmlns:w16cid="http://schemas.microsoft.com/office/word/2016/wordml/cid" xmlns:w16="http://schemas.microsoft.com/office/word/2018/wordml" xmlns:w16sdtdh="http://schemas.microsoft.com/office/word/2020/wordml/sdtdatahash" xmlns:w16se="http://schemas.microsoft.com/office/word/2015/wordml/symex" mc:Ignorable="w14 w15 w16se w16cid w16 w16cex w16sdtdh">
   <w:docDefaults>
     <w:rPrDefault>
       <w:rPr>

</xml_diff>